<commit_message>
adjust csv section to compliance review
</commit_message>
<xml_diff>
--- a/templates/ai-agent-code-review-template.docx
+++ b/templates/ai-agent-code-review-template.docx
@@ -1,6 +1,6 @@
 
 <file path=word/document.xml><?xml version="1.0" encoding="utf-8"?>
-<w:document xmlns:wpc="http://schemas.microsoft.com/office/word/2010/wordprocessingCanvas" xmlns:mc="http://schemas.openxmlformats.org/markup-compatibility/2006" xmlns:o="urn:schemas-microsoft-com:office:office" xmlns:r="http://schemas.openxmlformats.org/officeDocument/2006/relationships" xmlns:m="http://schemas.openxmlformats.org/officeDocument/2006/math" xmlns:v="urn:schemas-microsoft-com:vml" xmlns:wp14="http://schemas.microsoft.com/office/word/2010/wordprocessingDrawing" xmlns:wp="http://schemas.openxmlformats.org/drawingml/2006/wordprocessingDrawing" xmlns:w10="urn:schemas-microsoft-com:office:word" xmlns:w="http://schemas.openxmlformats.org/wordprocessingml/2006/main" xmlns:w14="http://schemas.microsoft.com/office/word/2010/wordml" xmlns:w15="http://schemas.microsoft.com/office/word/2012/wordml" xmlns:wpg="http://schemas.microsoft.com/office/word/2010/wordprocessingGroup" xmlns:wpi="http://schemas.microsoft.com/office/word/2010/wordprocessingInk" xmlns:wne="http://schemas.microsoft.com/office/word/2006/wordml" xmlns:wps="http://schemas.microsoft.com/office/word/2010/wordprocessingShape" mc:Ignorable="w14 w15 wp14">
+<w:document xmlns:ns1="http://schemas.openxmlformats.org/markup-compatibility/2006" xmlns:w="http://schemas.openxmlformats.org/wordprocessingml/2006/main" ns1:Ignorable="w14 w15 wp14">
   <w:body>
     <w:p>
       <w:pPr>
@@ -1347,35 +1347,32 @@
         <w:pStyle w:val="Heading1"/>
       </w:pPr>
       <w:r>
-        <w:rPr>
-          <w:b/>
-        </w:rPr>
-        <w:t xml:space="preserve">7. CSV安全漏洞专项审查</w:t>
-      </w:r>
-    </w:p>
-    <w:p>
-      <w:r>
-        <w:t xml:space="preserve">☐ CSV导出字段是否防止公式注入：=、+、-、@ 开头内容需转义或前置单引号</w:t>
-      </w:r>
-    </w:p>
-    <w:p>
-      <w:r>
-        <w:t xml:space="preserve">☐ CSV上传是否限制文件大小、行数、列数、编码和MIME类型</w:t>
-      </w:r>
-    </w:p>
-    <w:p>
-      <w:r>
-        <w:t xml:space="preserve">☐ 分隔符、引号、换行、多字节字符是否按CSV规范解析，避免字段错位</w:t>
-      </w:r>
-    </w:p>
-    <w:p>
-      <w:r>
-        <w:t xml:space="preserve">☐ 是否校验表头、必填列、字段类型和业务枚举，避免脏数据入库</w:t>
-      </w:r>
-    </w:p>
-    <w:p>
-      <w:r>
-        <w:t xml:space="preserve">☐ 是否防止通过CSV内容触发路径穿越、脚本注入、批量越权或资源耗尽</w:t>
+        <w:t>7. CSV安全合规专项审查</w:t>
+      </w:r>
+    </w:p>
+    <w:p>
+      <w:r>
+        <w:t>☐ 本次变更是否命中 CSV 安全合规审查范围</w:t>
+      </w:r>
+    </w:p>
+    <w:p>
+      <w:r>
+        <w:t>☐ 是否已调用 CSV 安全合规审查接口/工具</w:t>
+      </w:r>
+    </w:p>
+    <w:p>
+      <w:r>
+        <w:t>☐ CSV 审查结果是否通过</w:t>
+      </w:r>
+    </w:p>
+    <w:p>
+      <w:r>
+        <w:t>☐ CSV 审查发现的 Critical/High 风险是否已处理或阻断</w:t>
+      </w:r>
+    </w:p>
+    <w:p>
+      <w:r>
+        <w:t>☐ CSV 审查报告编号、流水号或外部报告链接是否已记录</w:t>
       </w:r>
     </w:p>
     <w:tbl>
@@ -1393,171 +1390,111 @@
       </w:tblPr>
       <w:tr>
         <w:tc>
-          <w:tcPr>
-            <w:tcW w:w="2400" w:type="dxa"/>
-          </w:tcPr>
-          <w:p>
-            <w:r>
-              <w:rPr>
-                <w:b/>
-              </w:rPr>
-              <w:t xml:space="preserve">文件路径</w:t>
-            </w:r>
-          </w:p>
-        </w:tc>
-        <w:tc>
-          <w:tcPr>
-            <w:tcW w:w="2400" w:type="dxa"/>
-          </w:tcPr>
-          <w:p>
-            <w:r>
-              <w:rPr>
-                <w:b/>
-              </w:rPr>
-              <w:t xml:space="preserve">行号</w:t>
-            </w:r>
-          </w:p>
-        </w:tc>
-        <w:tc>
-          <w:tcPr>
-            <w:tcW w:w="2400" w:type="dxa"/>
-          </w:tcPr>
-          <w:p>
-            <w:r>
-              <w:rPr>
-                <w:b/>
-              </w:rPr>
-              <w:t xml:space="preserve">CSV风险点</w:t>
-            </w:r>
-          </w:p>
-        </w:tc>
-        <w:tc>
-          <w:tcPr>
-            <w:tcW w:w="2400" w:type="dxa"/>
-          </w:tcPr>
-          <w:p>
-            <w:r>
-              <w:rPr>
-                <w:b/>
-              </w:rPr>
-              <w:t xml:space="preserve">风险等级</w:t>
-            </w:r>
-          </w:p>
-        </w:tc>
-        <w:tc>
-          <w:tcPr>
-            <w:tcW w:w="2400" w:type="dxa"/>
-          </w:tcPr>
-          <w:p>
-            <w:r>
-              <w:rPr>
-                <w:b/>
-              </w:rPr>
-              <w:t xml:space="preserve">修复建议</w:t>
-            </w:r>
-          </w:p>
-        </w:tc>
-      </w:tr>
-      <w:tr>
-        <w:tc>
-          <w:tcPr>
-            <w:tcW w:w="2400" w:type="dxa"/>
-          </w:tcPr>
-          <w:p>
-            <w:r>
-              <w:t xml:space="preserve"/>
-            </w:r>
-          </w:p>
-        </w:tc>
-        <w:tc>
-          <w:tcPr>
-            <w:tcW w:w="2400" w:type="dxa"/>
-          </w:tcPr>
-          <w:p>
-            <w:r>
-              <w:t xml:space="preserve"/>
-            </w:r>
-          </w:p>
-        </w:tc>
-        <w:tc>
-          <w:tcPr>
-            <w:tcW w:w="2400" w:type="dxa"/>
-          </w:tcPr>
-          <w:p>
-            <w:r>
-              <w:t xml:space="preserve"/>
-            </w:r>
-          </w:p>
-        </w:tc>
-        <w:tc>
-          <w:tcPr>
-            <w:tcW w:w="2400" w:type="dxa"/>
-          </w:tcPr>
-          <w:p>
-            <w:r>
-              <w:t xml:space="preserve"/>
-            </w:r>
-          </w:p>
-        </w:tc>
-        <w:tc>
-          <w:tcPr>
-            <w:tcW w:w="2400" w:type="dxa"/>
-          </w:tcPr>
-          <w:p>
-            <w:r>
-              <w:t xml:space="preserve"/>
-            </w:r>
-          </w:p>
-        </w:tc>
-      </w:tr>
-      <w:tr>
-        <w:tc>
-          <w:tcPr>
-            <w:tcW w:w="2400" w:type="dxa"/>
-          </w:tcPr>
-          <w:p>
-            <w:r>
-              <w:t xml:space="preserve"/>
-            </w:r>
-          </w:p>
-        </w:tc>
-        <w:tc>
-          <w:tcPr>
-            <w:tcW w:w="2400" w:type="dxa"/>
-          </w:tcPr>
-          <w:p>
-            <w:r>
-              <w:t xml:space="preserve"/>
-            </w:r>
-          </w:p>
-        </w:tc>
-        <w:tc>
-          <w:tcPr>
-            <w:tcW w:w="2400" w:type="dxa"/>
-          </w:tcPr>
-          <w:p>
-            <w:r>
-              <w:t xml:space="preserve"/>
-            </w:r>
-          </w:p>
-        </w:tc>
-        <w:tc>
-          <w:tcPr>
-            <w:tcW w:w="2400" w:type="dxa"/>
-          </w:tcPr>
-          <w:p>
-            <w:r>
-              <w:t xml:space="preserve"/>
-            </w:r>
-          </w:p>
-        </w:tc>
-        <w:tc>
-          <w:tcPr>
-            <w:tcW w:w="2400" w:type="dxa"/>
-          </w:tcPr>
-          <w:p>
-            <w:r>
-              <w:t xml:space="preserve"/>
+          <w:p>
+            <w:r>
+              <w:t>审查项</w:t>
+            </w:r>
+          </w:p>
+        </w:tc>
+        <w:tc>
+          <w:p>
+            <w:r>
+              <w:t>审查结果</w:t>
+            </w:r>
+          </w:p>
+        </w:tc>
+        <w:tc>
+          <w:p>
+            <w:r>
+              <w:t>风险等级</w:t>
+            </w:r>
+          </w:p>
+        </w:tc>
+        <w:tc>
+          <w:p>
+            <w:r>
+              <w:t>依据/流水号</w:t>
+            </w:r>
+          </w:p>
+        </w:tc>
+        <w:tc>
+          <w:p>
+            <w:r>
+              <w:t>处理建议</w:t>
+            </w:r>
+          </w:p>
+        </w:tc>
+      </w:tr>
+      <w:tr>
+        <w:tc>
+          <w:p>
+            <w:r>
+              <w:t>CSV安全合规接口/工具审查</w:t>
+            </w:r>
+          </w:p>
+        </w:tc>
+        <w:tc>
+          <w:p>
+            <w:r>
+              <w:t/>
+            </w:r>
+          </w:p>
+        </w:tc>
+        <w:tc>
+          <w:p>
+            <w:r>
+              <w:t/>
+            </w:r>
+          </w:p>
+        </w:tc>
+        <w:tc>
+          <w:p>
+            <w:r>
+              <w:t/>
+            </w:r>
+          </w:p>
+        </w:tc>
+        <w:tc>
+          <w:p>
+            <w:r>
+              <w:t/>
+            </w:r>
+          </w:p>
+        </w:tc>
+      </w:tr>
+      <w:tr>
+        <w:tc>
+          <w:p>
+            <w:r>
+              <w:t>CSV安全合规风险处理</w:t>
+            </w:r>
+          </w:p>
+        </w:tc>
+        <w:tc>
+          <w:p>
+            <w:r>
+              <w:t/>
+            </w:r>
+          </w:p>
+        </w:tc>
+        <w:tc>
+          <w:p>
+            <w:r>
+              <w:t/>
+            </w:r>
+          </w:p>
+        </w:tc>
+        <w:tc>
+          <w:p>
+            <w:r>
+              <w:t/>
+            </w:r>
+          </w:p>
+        </w:tc>
+        <w:tc>
+          <w:p>
+            <w:r>
+              <w:t/>
             </w:r>
           </w:p>
         </w:tc>
@@ -1692,12 +1629,9 @@
           </w:p>
         </w:tc>
         <w:tc>
-          <w:tcPr>
-            <w:tcW w:w="2400" w:type="dxa"/>
-          </w:tcPr>
-          <w:p>
-            <w:r>
-              <w:t xml:space="preserve">异常/安全/性能/规范/CSV安全</w:t>
+          <w:p>
+            <w:r>
+              <w:t>异常/安全/性能/规范/CSV安全合规</w:t>
             </w:r>
           </w:p>
         </w:tc>
@@ -1764,12 +1698,9 @@
           </w:p>
         </w:tc>
         <w:tc>
-          <w:tcPr>
-            <w:tcW w:w="2400" w:type="dxa"/>
-          </w:tcPr>
-          <w:p>
-            <w:r>
-              <w:t xml:space="preserve">异常/安全/性能/规范/CSV安全</w:t>
+          <w:p>
+            <w:r>
+              <w:t>异常/安全/性能/规范/CSV安全合规</w:t>
             </w:r>
           </w:p>
         </w:tc>
@@ -1836,12 +1767,9 @@
           </w:p>
         </w:tc>
         <w:tc>
-          <w:tcPr>
-            <w:tcW w:w="2400" w:type="dxa"/>
-          </w:tcPr>
-          <w:p>
-            <w:r>
-              <w:t xml:space="preserve">异常/安全/性能/规范/CSV安全</w:t>
+          <w:p>
+            <w:r>
+              <w:t>异常/安全/性能/规范/CSV安全合规</w:t>
             </w:r>
           </w:p>
         </w:tc>
@@ -1915,7 +1843,7 @@
     </w:p>
     <w:p>
       <w:r>
-        <w:t xml:space="preserve">☐ CSV导入/导出相关安全风险已完成专项确认</w:t>
+        <w:t>☐ CSV安全合规审查结果已完成确认</w:t>
       </w:r>
     </w:p>
     <w:p>

</xml_diff>